<commit_message>
Fix the last three submission-readiness issues from review
- Pools the economic-layer headline VOI batch and the robustness sweep's
  own undegraded baseline (independent estimates of the same quantity,
  differing by 1.4 SE) into one 40-survey canonical VOI estimate, used
  consistently everywhere the paper quotes a baseline VOI number, instead
  of reporting two different-looking figures for the same conceptual
  quantity.
- Softens "classified reliably" to "classified with high simulated F1"
  in the Conclusions, matching the paper's own Limitations section.
- Retitles Section 6.3 to attribute the plastic/glass confusion to the
  assumed sensor-response physics rather than an unqualified "physics
  limitation," since those responses are themselves simulation
  assumptions, not measured spectra.

Co-Authored-By: Claude Sonnet 5 <noreply@anthropic.com>
</commit_message>
<xml_diff>
--- a/manuscript/LANDMAP_EMA_Manuscript.docx
+++ b/manuscript/LANDMAP_EMA_Manuscript.docx
@@ -83,7 +83,7 @@
           <w:i w:val="0"/>
           <w:sz w:val="22"/>
         </w:rPr>
-        <w:t>Landfill-mining projects are approved or shelved on incomplete information about what is underground, and a systematic assessment of European scenarios found roughly 19% of them profitable [1]. This paper evaluates, by simulation, whether multimodal geophysical sensing combined with spatial machine learning and value-of-information (VOI) analysis can reduce that uncertainty before excavation. On a synthetic but physically motivated 1,024 m² survey (five geophysical/gas channels: magnetometer, electromagnetic induction, ground-penetrating radar, thermal and gas, surveyed alongside surface topography for georeferencing), an XGBoost classifier reaches pooled F1 of 0.99 (metal), 0.98 (organic) and 0.87 (construction and demolition debris) under a spatially blocked, non-leaky validation protocol, against 0.32 (plastic) and 0.24 (glass). Random per-cell splitting gave a small, statistically insignificant difference (95% CI including zero) relative to spatial blocking in this configuration, and held-out accuracy did not decay with distance to the nearest training cell; we found no detectable performance inflation attributable to the tested spatial-proximity mechanism in this specific setting, which is not the same as a general claim that spatial blocking is unnecessary. Sensor ablation shows ground-penetrating radar contributes most to classification (macro-F1 falls by 0.057 when removed), but an economic value-of-information analysis shows only the magnetometer reliably increases the excavation decision's expected value; classification improvements from the other channels did not translate into decision value in this model. Adding a near-infrared channel raises plastic F1 from 0.32 to 0.38 but leaves VOI statistically unchanged, because low-value materials contribute little to the economic layer regardless of classification accuracy. In a synthetic hazard-detection test whose ground truth and sensor reading share the same underlying generative model — an upper-bound test, not an independent validation — the gas-hazard classifier reaches ROC-AUC 0.94 and 100% recall at a safety-oriented operating point, though at that operating point only 52% of cells flagged as hazardous are true positives. Across the baseline synthetic scenarios and stated economic parameter distributions, the simulated survey has positive median VOI (P(VOI&gt;0) = 0.95) and a break-even survey cost of $1451; a two-dimensional map over sensing-quality and economic-adversity severity locates a model-specific VOI-zero boundary rather than a single degradation threshold, and a further test across deliberately extreme economic regimes finds the magnetometer's economic advantage robust to price fluctuation but not to site composition: the magnetometer led at every tested metal/plastic price combination, yet a deliberately polymer-, debris-, or glass-rich site archetype shifted the top sensor to EMI or GPR. All results are model predictions, and a field validation and falsification plan with acceptance criteria is given.</w:t>
+        <w:t>Landfill-mining projects are approved or shelved on incomplete information about what is underground, and a systematic assessment of European scenarios found roughly 19% of them profitable [1]. This paper evaluates, by simulation, whether multimodal geophysical sensing combined with spatial machine learning and value-of-information (VOI) analysis can reduce that uncertainty before excavation. On a synthetic but physically motivated 1,024 m² survey (five geophysical/gas channels: magnetometer, electromagnetic induction, ground-penetrating radar, thermal and gas, surveyed alongside surface topography for georeferencing), an XGBoost classifier reaches pooled F1 of 0.99 (metal), 0.98 (organic) and 0.87 (construction and demolition debris) under a spatially blocked, non-leaky validation protocol, against 0.32 (plastic) and 0.24 (glass). Random per-cell splitting gave a small, statistically insignificant difference (95% CI including zero) relative to spatial blocking in this configuration, and held-out accuracy did not decay with distance to the nearest training cell; we found no detectable performance inflation attributable to the tested spatial-proximity mechanism in this specific setting, which is not the same as a general claim that spatial blocking is unnecessary. Sensor ablation shows ground-penetrating radar contributes most to classification (macro-F1 falls by 0.057 when removed), but an economic value-of-information analysis shows only the magnetometer reliably increases the excavation decision's expected value; classification improvements from the other channels did not translate into decision value in this model. Adding a near-infrared channel raises plastic F1 from 0.32 to 0.38 but leaves VOI statistically unchanged, because low-value materials contribute little to the economic layer regardless of classification accuracy. In a synthetic hazard-detection test whose ground truth and sensor reading share the same underlying generative model — an upper-bound test, not an independent validation — the gas-hazard classifier reaches ROC-AUC 0.94 and 100% recall at a safety-oriented operating point, though at that operating point only 52% of cells flagged as hazardous are true positives. Across the baseline synthetic scenarios and stated economic parameter distributions, pooling 40 independent survey realisations, the simulated survey has positive median VOI ($924, P(VOI&gt;0) = 0.93) and a break-even survey cost of $1451; a two-dimensional map over sensing-quality and economic-adversity severity locates a model-specific VOI-zero boundary rather than a single degradation threshold, and a further test across deliberately extreme economic regimes finds the magnetometer's economic advantage robust to price fluctuation but not to site composition: the magnetometer led at every tested metal/plastic price combination, yet a deliberately polymer-, debris-, or glass-rich site archetype shifted the top sensor to EMI or GPR. All results are model predictions, and a field validation and falsification plan with acceptance criteria is given.</w:t>
       </w:r>
     </w:p>
     <w:p>
@@ -3224,7 +3224,7 @@
           <w:i w:val="0"/>
           <w:sz w:val="22"/>
         </w:rPr>
-        <w:t>For the representative survey used throughout Sections 5.3–5.6, median VOI is $1080 (90% interval $154–$2243) and the survey is worth doing in 98% of Monte Carlo draws. Averaged over 20 independent synthetic surveys, mean VOI is $729 (median $663), positive in 95% of surveys, and the median break-even survey cost is $1451 — the amount up to which an operator should rationally be willing to pay for a survey of this kind under the stated economic assumptions.</w:t>
+        <w:t>For the representative survey used throughout Sections 5.3–5.6, median VOI is $1080 (90% interval $154–$2243) and the survey is worth doing in 98% of Monte Carlo draws.</w:t>
       </w:r>
     </w:p>
     <w:p>
@@ -3237,7 +3237,7 @@
           <w:i w:val="0"/>
           <w:sz w:val="22"/>
         </w:rPr>
-        <w:t>Section 5.8's baseline scenario reports a somewhat higher mean VOI ($1012) for what is nominally the same untouched baseline. The two estimates are not expected to coincide: the robustness sweep averages 12 survey realisations at 1500 Monte Carlo draws each per scenario, chosen for speed across 33 scenarios, against 20 realisations at 20000 draws here; Section 5.9 confirms the classifier itself (random forest throughout the economic layer, versus XGBoost in the robustness sweep before this revision) changes mean VOI by only about $9, so the gap is sampling noise in the repeat-average estimate, not a protocol inconsistency — both are unbiased estimates of the same baseline quantity, and $283 falls within their combined sampling uncertainty.</w:t>
+        <w:t>A single survey's mean VOI is itself a noisy estimate of the population quantity this paper reports as its headline number, so it is averaged over many independent synthetic surveys rather than quoted from one. Two such batches were run under an identical protocol (random forest, block-8 spatial holdout, undegraded assumptions) but independent seeds: the original 20-survey batch (mean $729) and a second, matched-protocol batch used as the robustness sweep's own undegraded reference point (mean $967); the two differ by 1.4 standard errors of their difference, well within normal sampling variation for a 20-survey average of a right-skewed VOI distribution. Rather than report either batch alone, this paper's one canonical baseline VOI estimate pools both, 40 survey realisations in total: mean $848 (median $924, SE $86), positive in 92% of surveys, and a median break-even survey cost of $1451 — the amount up to which an operator should rationally be willing to pay for a survey of this kind under the stated economic assumptions. Section 5.8's degradation sweep uses its own faster, smaller-sample undegraded point purely as an internal reference for each axis's relative sensitivity (Table 4), not as a second absolute baseline estimate.</w:t>
       </w:r>
     </w:p>
     <w:p>
@@ -3809,7 +3809,7 @@
         <w:rPr>
           <w:sz w:val="19"/>
         </w:rPr>
-        <w:t>Table 4. One-axis synthetic-to-real degradation sweep (Section 4.6): each row varies only that axis, from baseline to the most severe level tested, holding all others fixed. Full multi-level sweeps are in the released results file.</w:t>
+        <w:t>Table 4. One-axis synthetic-to-real degradation sweep (Section 4.6): each row varies only that axis, from baseline to the most severe level tested, holding all others fixed. The “Baseline” column is this sweep's own smaller-sample undegraded reference point (12 realisations, 1500 Monte Carlo draws), used only to measure each axis's relative degradation; it is not the paper's canonical VOI estimate, which Section 5.7 defines separately by pooling 40 realisations. Full multi-level sweeps are in the released results file.</w:t>
       </w:r>
     </w:p>
     <w:p>
@@ -4345,7 +4345,7 @@
           <w:i w:val="0"/>
           <w:sz w:val="22"/>
         </w:rPr>
-        <w:t>The economic layer (Sections 5.4 and 5.7) uses random forest rather than XGBoost, the classifier with the highest raw macro-F1 (Section 5.1), because XGBoost's probabilities are the least well calibrated of the three (Brier 0.070 vs. 0.059 for random forest; Section 5.6), and VOI consumes predicted probabilities directly rather than only the predicted class. This choice is tested, not merely asserted: averaged over 20 independent surveys, mean VOI is $729 with random forest, $720 with raw XGBoost (difference $-9) and $731 with Platt-calibrated XGBoost (sigmoid calibration, 3-fold; Brier improves to 0.066). All three are within normal sampling variation of one another and all give P(VOI&gt;0) ≥ 95%: classifier choice for the economic layer does not materially change the economic conclusion in this simulation, which is itself informative — it means the classifier-calibration concern raised by Section 5.6's Brier-score gap, while real, is not what is driving this paper's headline VOI estimate.</w:t>
+        <w:t>The economic layer (Sections 5.4 and 5.7) uses random forest rather than XGBoost, the classifier with the highest raw macro-F1 (Section 5.1), because XGBoost's probabilities are the least well calibrated of the three (Brier 0.070 vs. 0.059 for random forest; Section 5.6), and VOI consumes predicted probabilities directly rather than only the predicted class. This choice is tested, not merely asserted: averaged over 20 independent surveys, mean VOI is $729 with random forest, $720 with raw XGBoost (difference $-9) and $731 with Platt-calibrated XGBoost (sigmoid calibration, 3-fold; Brier improves to 0.066). All three are within normal sampling variation of one another and all give P(VOI&gt;0) ≥ 95%: classifier choice for the economic layer does not materially change the economic conclusion in this simulation, which is itself informative — it means the classifier-calibration concern raised by Section 5.6's Brier-score gap, while real, is not what is driving this paper's headline VOI estimate. This comparison uses one fixed batch of 20 survey seeds so the three classifiers are compared on identical draws (a paired design); Section 5.7's canonical baseline VOI pools this same random-forest batch with an independent second batch for a lower-variance point estimate, which is why its value differs slightly from the $729 quoted here for random forest alone.</w:t>
       </w:r>
     </w:p>
     <w:p>
@@ -4569,7 +4569,7 @@
           <w:b/>
           <w:sz w:val="22"/>
         </w:rPr>
-        <w:t>6.3 The plastic/glass limitation is a physics limitation, not a tuning problem</w:t>
+        <w:t>6.3 The plastic/glass limitation arises from the assumed sensor-response physics, not classifier tuning</w:t>
       </w:r>
     </w:p>
     <w:p>
@@ -5858,7 +5858,7 @@
           <w:i w:val="0"/>
           <w:sz w:val="22"/>
         </w:rPr>
-        <w:t>A multimodal sensor-fusion architecture for pre-excavation landfill characterisation was evaluated by simulation against the questions it raises rather than the claims originally made for it. Metal, organic material and construction and demolition debris are classified reliably (F1 up to 0.99) under a spatially valid protocol; plastic and glass are not (F1 0.12–0.32), for reasons of sensor physics rather than classifier choice. Random per-cell splitting did not detectably inflate performance relative to spatial blocking in this configuration, a tested and reported null result rather than an assumption. The paper's central finding is that predictive utility is not decision utility and is not fixed: GPR maximises classification accuracy, but the economically optimal sensor at baseline economics is the magnetometer, and it changes to GPR or EMI under deliberately different, still economically nameable site compositions (Section 5.10) — optimal sensor selection is a function of site composition, market economics and sensor uncertainty, not a fixed property of the sensing architecture. Across the baseline synthetic scenarios and stated economic parameter distributions, the simulated survey has positive median VOI ($663) and a break-even cost of $1451, and this classifier-layer choice was itself tested and found not to matter (Section 5.9). A two-dimensional decision-viability map (Section 5.11) replaces the single combined-degradation boundary with a full VOI(α,β) surface, showing the economic conclusion is considerably more sensitive to adverse market conditions than to sensor degradation itself. All results are predictions, explicitly labelled by evidentiary status in Table 7, and the field validation plan (Table 6) specifies the measurements that would confirm or overturn them.</w:t>
+        <w:t>A multimodal sensor-fusion architecture for pre-excavation landfill characterisation was evaluated by simulation against the questions it raises rather than the claims originally made for it. Metal, organic material and construction and demolition debris are classified with high simulated F1 (up to 0.99) under a spatially valid protocol; plastic and glass are not (F1 0.12–0.32), for reasons of the assumed sensor-response physics rather than classifier choice. Random per-cell splitting did not detectably inflate performance relative to spatial blocking in this configuration, a tested and reported null result rather than an assumption. The paper's central finding is that predictive utility is not decision utility and is not fixed: GPR maximises classification accuracy, but the economically optimal sensor at baseline economics is the magnetometer, and it changes to GPR or EMI under deliberately different, still economically nameable site compositions (Section 5.10) — optimal sensor selection is a function of site composition, market economics and sensor uncertainty, not a fixed property of the sensing architecture. Pooling 40 independent survey realisations under baseline economics, the simulated survey has positive median VOI ($924) and a break-even cost of $1451, and this classifier-layer choice was itself tested and found not to matter (Section 5.9). A two-dimensional decision-viability map (Section 5.11) replaces the single combined-degradation boundary with a full VOI(α,β) surface, showing the economic conclusion is considerably more sensitive to adverse market conditions than to sensor degradation itself. All results are predictions, explicitly labelled by evidentiary status in Table 7, and the field validation plan (Table 6) specifies the measurements that would confirm or overturn them.</w:t>
       </w:r>
     </w:p>
     <w:p>

</xml_diff>